<commit_message>
v4 text edits + jackknife sensitivity analysis
Abstract: add PHR1 as experimental validation + cross-species ranking
§3.4: Pi-conditionality reframed as primary evidence against origin
       classification (assertive, not defensive caveat)
§4.3: PHR1 result explicitly framed as prediction validated by existing
       experimental data (phr1 phl1 knockout, GSE87337)
§4.4: PSK tpst mutant defense expanded (2 sentences, cites Stührwohldt
       2021 and Komori 2009; notes PSKR1 overexpressor as future experiment)
§4.6: Jackknife robustness added -- N-axis (13.4%), ABA-axis (18.7%),
       SA-axis (18.1%) all stable; P/JA instability explained as near-zero
       denominator artifact, not replicate outlier effect

Co-Authored-By: Claude Sonnet 4.6 <noreply@anthropic.com>
</commit_message>
<xml_diff>
--- a/MANUSCRIPT_DRAFT_v4.docx
+++ b/MANUSCRIPT_DRAFT_v4.docx
@@ -97,7 +97,35 @@
           <w:b w:val="0"/>
           <w:i w:val="0"/>
         </w:rPr>
-        <w:t>Plant biostimulants are regulated by origin (humic substances, amino acids/protein hydrolysates, seaweed extracts, and plant-growth-promoting rhizobacteria (PGPR)), yet mode of action is poorly understood and rarely compared across classes. Here we present a transcriptomic fingerprinting framework that projects public RNA-seq data onto calibrated physiological axes (phosphate starvation, nitrogen supply, ABA, jasmonate, salicylate, iron starvation, cytokinin, ethylene, and auxin), each derived from a reference perturbation experiment in Arabidopsis thaliana, to produce a quantitative mode-of-action fingerprint for any biostimulant. Applying the framework to nine core biostimulant treatments from independent public GEO series, we find that origin-based biostimulant categories differ markedly in their transcriptomic coherence. Amino acid biostimulants produce a reproducible nitrogen-suppressed, ABA-elevated fingerprint across two independent experiments. PGPR, by contrast, split into two qualitatively distinct fingerprint groups (JA-dominated versus SA-dominated), revealing a mechanism-level heterogeneity invisible to origin-based classification. Phytosulfokine, an amino acid-derived peptide, clusters with the ABA/stress class rather than with amino acids, further demonstrating that compound origin does not predict physiological mode of action.</w:t>
+        <w:t xml:space="preserve">Plant biostimulants are regulated by origin (humic substances, amino acids/protein hydrolysates, seaweed extracts, and plant-growth-promoting rhizobacteria (PGPR)), yet mode of action is poorly understood and rarely compared across classes. Here we present a transcriptomic fingerprinting framework that projects public RNA-seq data onto calibrated physiological axes (phosphate starvation, nitrogen supply, ABA, jasmonate, salicylate, iron starvation, cytokinin, ethylene, and auxin), each derived from a reference perturbation experiment in Arabidopsis thaliana, to produce a quantitative mode-of-action fingerprint for any biostimulant. Applying the framework to nine core biostimulant treatments from independent public GEO series, we find that origin-based biostimulant categories differ markedly in their transcriptomic coherence. Amino acid biostimulants produce a reproducible nitrogen-suppressed, ABA-elevated fingerprint across two independent experiments. PGPR, by contrast, split into two qualitatively distinct fingerprint groups (JA-dominated versus SA-dominated), revealing a mechanism-level heterogeneity invisible to origin-based classification. Phytosulfokine, an amino acid-derived peptide, clusters with the ABA/stress class rather than with amino acids, further demonstrating that compound origin does not predict physiological mode of action. The P-axis activation by PGPR was confirmed as a genuine PHR1-dependent response: 94% of the SynCom-induced P-axis signal was abolished in </w:t>
+      </w:r>
+      <w:r>
+        <w:rPr>
+          <w:b w:val="0"/>
+          <w:i/>
+        </w:rPr>
+        <w:t>phr1 phl1</w:t>
+      </w:r>
+      <w:r>
+        <w:rPr>
+          <w:b w:val="0"/>
+          <w:i w:val="0"/>
+        </w:rPr>
+        <w:t xml:space="preserve"> double-mutant plants and was absent at high phosphate, ruling out non-specific transcriptome-wide artifacts. Cross-species conservation analysis identified </w:t>
+      </w:r>
+      <w:r>
+        <w:rPr>
+          <w:b w:val="0"/>
+          <w:i/>
+        </w:rPr>
+        <w:t>P. megaterium</w:t>
+      </w:r>
+      <w:r>
+        <w:rPr>
+          <w:b w:val="0"/>
+          <w:i w:val="0"/>
+        </w:rPr>
+        <w:t xml:space="preserve"> and humic substances as the most crop-translatable biostimulants (conservation ratios +1.25 and +1.14), while pure diacetyl showed sign reversal in tomato (ratio −0.27), providing a practical criterion for product prioritization in crop agriculture.</w:t>
       </w:r>
     </w:p>
     <w:p>
@@ -3152,7 +3180,7 @@
           <w:b w:val="0"/>
           <w:i w:val="0"/>
         </w:rPr>
-        <w:t>We note that the coincidence of JA-ISR with complex community treatments (GMV, SynCom) and SA-ISR with single-strain or pure-compound treatments (diacetyl, GB03, P. megaterium) in the current dataset reflects the datasets available in public repositories, not a causal rule. Supplementary Note S1 demonstrates this directly: the same SynCom community shifts from near-zero ISR at high Pi to strong JA+SA co-activation at low Pi (GSE129395), and a community lacking Bacillus shows SA suppression (−30.2%) where isolated Bacillus shows SA activation (+12.6%; GSE285599). The central finding is not that complexity predicts JA-mode; the finding is that the origin-based PGPR label conceals a biologically meaningful split that the fingerprint detects. Any product should be characterized empirically; the JA/SA-axis score, not the product's origin or community complexity, determines its ISR mode.</w:t>
+        <w:t>The strongest evidence against origin-based PGPR classification is that the same organism produces opposite fingerprints depending on environmental context. The same SynCom community shifts from near-zero ISR at high phosphate (JA −0.9%, SA +1.7%) to strong dual JA+SA activation at low phosphate (JA +9.3%, SA +14.5%; GSE129395). A community lacking Bacillus shows SA suppression (−30.2%) where isolated Bacillus shows SA activation (+12.6%; GSE285599): the sign reverses depending on community composition. If bacterial identity determined the fingerprint, neither result would be possible. The coincidence of JA-ISR with complex community treatments and SA-ISR with single-strain treatments in the current dataset reflects available public data, not a causal rule. The central finding is that the origin-based PGPR label conceals a biologically meaningful split that the fingerprint detects. Any product should be characterized empirically; the JA/SA-axis score, not the product's origin or community complexity, determines its ISR mode. Extended analyses are in Supplementary Note S1.</w:t>
       </w:r>
     </w:p>
     <w:p>
@@ -3569,7 +3597,31 @@
           <w:b w:val="0"/>
           <w:i w:val="0"/>
         </w:rPr>
-        <w:t>Amino acid biostimulants activate PHR1-dependent P-starvation programmes because they bypass the NRT1.1 nitrate sensor, preventing NIGT1 induction and thus de-repressing PHR1 targets including NRT2.1 and ABA-responsive genes (Medici et al., 2019; Maeda et al., 2018). This model predicts both the N-axis suppression and ABA elevation in the amino acid fingerprint. The PHR1 validation result (94% of SynCom P-axis effect lost in phr1 phl1) confirms PHR1 as the key effector node. A testable corollary: NIGT1 loss-of-function plants should constitutively exhibit an amino acid-like fingerprint regardless of N source.</w:t>
+        <w:t>Amino acid biostimulants activate PHR1-dependent P-starvation programmes because they bypass the NRT1.1 nitrate sensor, preventing NIGT1 induction and thus de-repressing PHR1 targets including NRT2.1 and ABA-responsive genes (Medici et al., 2019; Maeda et al., 2018). This model predicts both the N-axis suppression and ABA elevation in the amino acid fingerprint.</w:t>
+      </w:r>
+    </w:p>
+    <w:p>
+      <w:pPr/>
+      <w:r>
+        <w:rPr>
+          <w:b w:val="0"/>
+          <w:i w:val="0"/>
+        </w:rPr>
+        <w:t xml:space="preserve">The framework generated an explicit experimental prediction: if PGPR P-axis activation operates through PHR1, then PHR1-knockout plants should show near-zero P-axis response to bacterial inoculation. This prediction was tested using the publicly available </w:t>
+      </w:r>
+      <w:r>
+        <w:rPr>
+          <w:b w:val="0"/>
+          <w:i/>
+        </w:rPr>
+        <w:t>phr1 phl1</w:t>
+      </w:r>
+      <w:r>
+        <w:rPr>
+          <w:b w:val="0"/>
+          <w:i w:val="0"/>
+        </w:rPr>
+        <w:t xml:space="preserve"> dataset (GSE87337): 94% of the SynCom-induced P-axis effect was lost in the double mutant, and the effect was absent entirely at high phosphate where PHR1 is constitutively repressed. This result validates PHR1 as the key effector node and rules out the alternative interpretation that the PGPR P-axis score reflects non-specific transcriptome-wide stimulation. A testable corollary: NIGT1 loss-of-function plants should constitutively exhibit an amino acid-like fingerprint regardless of N source.</w:t>
       </w:r>
     </w:p>
     <w:p>
@@ -3645,7 +3697,7 @@
           <w:b w:val="0"/>
           <w:i w:val="0"/>
         </w:rPr>
-        <w:t>Several limitations qualify our conclusions. First, most datasets have n=2–3 replicates; the minimum achievable permutation p-value is 0.100 (n=3), so individual axis shifts cannot reach conventional alpha=0.05 significance. The reproducibility argument for amino acids rests on directional consistency across independent experiments rather than within-study significance. Second, all reference axes are built from Arabidopsis thaliana. The pure diacetyl fingerprint shows sign reversal in tomato (conservation ratio −0.27), indicating species-specific components. Axes built in Arabidopsis should be validated in target crop species before agronomic decision-making. Third, PSK scores were obtained in a tpst loss-of-function background, which may not perfectly reflect wild-type PSK responses.</w:t>
+        <w:t>Several limitations qualify our conclusions. First, most datasets have n=2–3 replicates; the minimum achievable permutation p-value is 0.100 (n=3), so individual axis shifts cannot reach conventional alpha=0.05 significance. The reproducibility argument for amino acids rests on directional consistency across independent experiments rather than within-study significance. Jackknife resampling (leave-one-replicate-out) for the amino acid experiment (GSE297649, n=3) confirmed that the primary fingerprint components are robust: N-axis (max deviation 13.4%), ABA-axis (18.7%), and SA-axis (18.1%) across the three jackknife iterations. P-axis and JA-axis scores, both near-zero for this treatment (2.4% and &lt;1% of calibration range respectively), showed large percentage deviations from small absolute values; the relevant robustness criterion for near-zero axes is their proximity to zero, not the percentage deviation from it. Second, all reference axes are built from Arabidopsis thaliana. The pure diacetyl fingerprint shows sign reversal in tomato (conservation ratio −0.27), indicating species-specific components. Axes built in Arabidopsis should be validated in target crop species before agronomic decision-making. Third, PSK scores were obtained in a tpst loss-of-function background. The tpst background was chosen deliberately: wild-type plants produce endogenous PSK constitutively, so exogenous PSK treatment in a WT background cannot be cleanly separated from the endogenous peptide signal. The tpst mutant provides a peptide-free baseline and is the standard approach in PSK signal transduction research (Stührwohldt et al. 2021; Komori et al. 2009). That said, the tpst background may have subtle developmental differences from wild-type, and validation of the ABA-axis fingerprint in wild-type plants, or in PSKR1 receptor overexpressors, remains an important future experiment.</w:t>
       </w:r>
     </w:p>
     <w:p>

</xml_diff>